<commit_message>
Added enemies to doc
</commit_message>
<xml_diff>
--- a/Kevin doc/Kevin Doc Day2.docx
+++ b/Kevin doc/Kevin Doc Day2.docx
@@ -32,6 +32,7 @@
       </w:r>
       <w:r>
         <w:rPr>
+          <w:noProof/>
           <w:sz w:val="40"/>
           <w:szCs w:val="40"/>
         </w:rPr>
@@ -81,6 +82,7 @@
       </w:pPr>
       <w:r>
         <w:rPr>
+          <w:noProof/>
           <w:sz w:val="40"/>
           <w:szCs w:val="40"/>
         </w:rPr>
@@ -130,6 +132,7 @@
       </w:pPr>
       <w:r>
         <w:rPr>
+          <w:noProof/>
           <w:sz w:val="40"/>
           <w:szCs w:val="40"/>
         </w:rPr>
@@ -193,6 +196,7 @@
       </w:r>
       <w:r>
         <w:rPr>
+          <w:noProof/>
           <w:sz w:val="40"/>
           <w:szCs w:val="40"/>
         </w:rPr>
@@ -232,6 +236,357 @@
           </wp:inline>
         </w:drawing>
       </w:r>
+    </w:p>
+    <w:p>
+      <w:pPr>
+        <w:rPr>
+          <w:sz w:val="40"/>
+          <w:szCs w:val="40"/>
+        </w:rPr>
+      </w:pPr>
+      <w:r>
+        <w:rPr>
+          <w:sz w:val="40"/>
+          <w:szCs w:val="40"/>
+        </w:rPr>
+        <w:lastRenderedPageBreak/>
+        <w:t xml:space="preserve">9:20 – 9:40 Improving Enemy </w:t>
+      </w:r>
+      <w:proofErr w:type="spellStart"/>
+      <w:r>
+        <w:rPr>
+          <w:sz w:val="40"/>
+          <w:szCs w:val="40"/>
+        </w:rPr>
+        <w:t>Behaviour</w:t>
+      </w:r>
+      <w:proofErr w:type="spellEnd"/>
+    </w:p>
+    <w:p>
+      <w:pPr>
+        <w:rPr>
+          <w:sz w:val="40"/>
+          <w:szCs w:val="40"/>
+        </w:rPr>
+      </w:pPr>
+      <w:r>
+        <w:rPr>
+          <w:sz w:val="40"/>
+          <w:szCs w:val="40"/>
+        </w:rPr>
+        <w:drawing>
+          <wp:inline distT="0" distB="0" distL="0" distR="0" wp14:anchorId="16A09CC5" wp14:editId="1FF5D38E">
+            <wp:extent cx="5943600" cy="2809240"/>
+            <wp:effectExtent l="0" t="0" r="0" b="0"/>
+            <wp:docPr id="324379220" name="Picture 1"/>
+            <wp:cNvGraphicFramePr>
+              <a:graphicFrameLocks xmlns:a="http://schemas.openxmlformats.org/drawingml/2006/main" noChangeAspect="1"/>
+            </wp:cNvGraphicFramePr>
+            <a:graphic xmlns:a="http://schemas.openxmlformats.org/drawingml/2006/main">
+              <a:graphicData uri="http://schemas.openxmlformats.org/drawingml/2006/picture">
+                <pic:pic xmlns:pic="http://schemas.openxmlformats.org/drawingml/2006/picture">
+                  <pic:nvPicPr>
+                    <pic:cNvPr id="324379220" name=""/>
+                    <pic:cNvPicPr/>
+                  </pic:nvPicPr>
+                  <pic:blipFill>
+                    <a:blip r:embed="rId8"/>
+                    <a:stretch>
+                      <a:fillRect/>
+                    </a:stretch>
+                  </pic:blipFill>
+                  <pic:spPr>
+                    <a:xfrm>
+                      <a:off x="0" y="0"/>
+                      <a:ext cx="5943600" cy="2809240"/>
+                    </a:xfrm>
+                    <a:prstGeom prst="rect">
+                      <a:avLst/>
+                    </a:prstGeom>
+                  </pic:spPr>
+                </pic:pic>
+              </a:graphicData>
+            </a:graphic>
+          </wp:inline>
+        </w:drawing>
+      </w:r>
+    </w:p>
+    <w:p>
+      <w:pPr>
+        <w:rPr>
+          <w:sz w:val="40"/>
+          <w:szCs w:val="40"/>
+        </w:rPr>
+      </w:pPr>
+      <w:r>
+        <w:rPr>
+          <w:sz w:val="40"/>
+          <w:szCs w:val="40"/>
+        </w:rPr>
+        <w:drawing>
+          <wp:inline distT="0" distB="0" distL="0" distR="0" wp14:anchorId="3D8BBB4A" wp14:editId="349CE03F">
+            <wp:extent cx="2781541" cy="624894"/>
+            <wp:effectExtent l="0" t="0" r="0" b="3810"/>
+            <wp:docPr id="1060281945" name="Picture 1"/>
+            <wp:cNvGraphicFramePr>
+              <a:graphicFrameLocks xmlns:a="http://schemas.openxmlformats.org/drawingml/2006/main" noChangeAspect="1"/>
+            </wp:cNvGraphicFramePr>
+            <a:graphic xmlns:a="http://schemas.openxmlformats.org/drawingml/2006/main">
+              <a:graphicData uri="http://schemas.openxmlformats.org/drawingml/2006/picture">
+                <pic:pic xmlns:pic="http://schemas.openxmlformats.org/drawingml/2006/picture">
+                  <pic:nvPicPr>
+                    <pic:cNvPr id="1060281945" name=""/>
+                    <pic:cNvPicPr/>
+                  </pic:nvPicPr>
+                  <pic:blipFill>
+                    <a:blip r:embed="rId9"/>
+                    <a:stretch>
+                      <a:fillRect/>
+                    </a:stretch>
+                  </pic:blipFill>
+                  <pic:spPr>
+                    <a:xfrm>
+                      <a:off x="0" y="0"/>
+                      <a:ext cx="2781541" cy="624894"/>
+                    </a:xfrm>
+                    <a:prstGeom prst="rect">
+                      <a:avLst/>
+                    </a:prstGeom>
+                  </pic:spPr>
+                </pic:pic>
+              </a:graphicData>
+            </a:graphic>
+          </wp:inline>
+        </w:drawing>
+      </w:r>
+      <w:r>
+        <w:rPr>
+          <w:sz w:val="40"/>
+          <w:szCs w:val="40"/>
+        </w:rPr>
+        <w:t xml:space="preserve"> oof</w:t>
+      </w:r>
+    </w:p>
+    <w:p>
+      <w:pPr>
+        <w:rPr>
+          <w:sz w:val="40"/>
+          <w:szCs w:val="40"/>
+        </w:rPr>
+      </w:pPr>
+      <w:r>
+        <w:rPr>
+          <w:sz w:val="40"/>
+          <w:szCs w:val="40"/>
+        </w:rPr>
+        <w:drawing>
+          <wp:inline distT="0" distB="0" distL="0" distR="0" wp14:anchorId="01075468" wp14:editId="4C298FDD">
+            <wp:extent cx="5943600" cy="1017270"/>
+            <wp:effectExtent l="0" t="0" r="0" b="0"/>
+            <wp:docPr id="1202395325" name="Picture 1"/>
+            <wp:cNvGraphicFramePr>
+              <a:graphicFrameLocks xmlns:a="http://schemas.openxmlformats.org/drawingml/2006/main" noChangeAspect="1"/>
+            </wp:cNvGraphicFramePr>
+            <a:graphic xmlns:a="http://schemas.openxmlformats.org/drawingml/2006/main">
+              <a:graphicData uri="http://schemas.openxmlformats.org/drawingml/2006/picture">
+                <pic:pic xmlns:pic="http://schemas.openxmlformats.org/drawingml/2006/picture">
+                  <pic:nvPicPr>
+                    <pic:cNvPr id="1202395325" name=""/>
+                    <pic:cNvPicPr/>
+                  </pic:nvPicPr>
+                  <pic:blipFill>
+                    <a:blip r:embed="rId10"/>
+                    <a:stretch>
+                      <a:fillRect/>
+                    </a:stretch>
+                  </pic:blipFill>
+                  <pic:spPr>
+                    <a:xfrm>
+                      <a:off x="0" y="0"/>
+                      <a:ext cx="5943600" cy="1017270"/>
+                    </a:xfrm>
+                    <a:prstGeom prst="rect">
+                      <a:avLst/>
+                    </a:prstGeom>
+                  </pic:spPr>
+                </pic:pic>
+              </a:graphicData>
+            </a:graphic>
+          </wp:inline>
+        </w:drawing>
+      </w:r>
+    </w:p>
+    <w:p>
+      <w:pPr>
+        <w:rPr>
+          <w:sz w:val="40"/>
+          <w:szCs w:val="40"/>
+        </w:rPr>
+      </w:pPr>
+      <w:r>
+        <w:rPr>
+          <w:sz w:val="40"/>
+          <w:szCs w:val="40"/>
+        </w:rPr>
+        <w:drawing>
+          <wp:inline distT="0" distB="0" distL="0" distR="0" wp14:anchorId="222B9AEC" wp14:editId="7E85D994">
+            <wp:extent cx="5943600" cy="924560"/>
+            <wp:effectExtent l="0" t="0" r="0" b="8890"/>
+            <wp:docPr id="152596744" name="Picture 1"/>
+            <wp:cNvGraphicFramePr>
+              <a:graphicFrameLocks xmlns:a="http://schemas.openxmlformats.org/drawingml/2006/main" noChangeAspect="1"/>
+            </wp:cNvGraphicFramePr>
+            <a:graphic xmlns:a="http://schemas.openxmlformats.org/drawingml/2006/main">
+              <a:graphicData uri="http://schemas.openxmlformats.org/drawingml/2006/picture">
+                <pic:pic xmlns:pic="http://schemas.openxmlformats.org/drawingml/2006/picture">
+                  <pic:nvPicPr>
+                    <pic:cNvPr id="152596744" name=""/>
+                    <pic:cNvPicPr/>
+                  </pic:nvPicPr>
+                  <pic:blipFill>
+                    <a:blip r:embed="rId11"/>
+                    <a:stretch>
+                      <a:fillRect/>
+                    </a:stretch>
+                  </pic:blipFill>
+                  <pic:spPr>
+                    <a:xfrm>
+                      <a:off x="0" y="0"/>
+                      <a:ext cx="5943600" cy="924560"/>
+                    </a:xfrm>
+                    <a:prstGeom prst="rect">
+                      <a:avLst/>
+                    </a:prstGeom>
+                  </pic:spPr>
+                </pic:pic>
+              </a:graphicData>
+            </a:graphic>
+          </wp:inline>
+        </w:drawing>
+      </w:r>
+    </w:p>
+    <w:p>
+      <w:pPr>
+        <w:rPr>
+          <w:sz w:val="40"/>
+          <w:szCs w:val="40"/>
+        </w:rPr>
+      </w:pPr>
+      <w:r>
+        <w:rPr>
+          <w:sz w:val="40"/>
+          <w:szCs w:val="40"/>
+        </w:rPr>
+        <w:drawing>
+          <wp:inline distT="0" distB="0" distL="0" distR="0" wp14:anchorId="248A7734" wp14:editId="6F0BC7D3">
+            <wp:extent cx="2941575" cy="975445"/>
+            <wp:effectExtent l="0" t="0" r="0" b="0"/>
+            <wp:docPr id="1804274896" name="Picture 1"/>
+            <wp:cNvGraphicFramePr>
+              <a:graphicFrameLocks xmlns:a="http://schemas.openxmlformats.org/drawingml/2006/main" noChangeAspect="1"/>
+            </wp:cNvGraphicFramePr>
+            <a:graphic xmlns:a="http://schemas.openxmlformats.org/drawingml/2006/main">
+              <a:graphicData uri="http://schemas.openxmlformats.org/drawingml/2006/picture">
+                <pic:pic xmlns:pic="http://schemas.openxmlformats.org/drawingml/2006/picture">
+                  <pic:nvPicPr>
+                    <pic:cNvPr id="1804274896" name=""/>
+                    <pic:cNvPicPr/>
+                  </pic:nvPicPr>
+                  <pic:blipFill>
+                    <a:blip r:embed="rId12"/>
+                    <a:stretch>
+                      <a:fillRect/>
+                    </a:stretch>
+                  </pic:blipFill>
+                  <pic:spPr>
+                    <a:xfrm>
+                      <a:off x="0" y="0"/>
+                      <a:ext cx="2941575" cy="975445"/>
+                    </a:xfrm>
+                    <a:prstGeom prst="rect">
+                      <a:avLst/>
+                    </a:prstGeom>
+                  </pic:spPr>
+                </pic:pic>
+              </a:graphicData>
+            </a:graphic>
+          </wp:inline>
+        </w:drawing>
+      </w:r>
+    </w:p>
+    <w:p>
+      <w:pPr>
+        <w:rPr>
+          <w:sz w:val="40"/>
+          <w:szCs w:val="40"/>
+        </w:rPr>
+      </w:pPr>
+      <w:r>
+        <w:rPr>
+          <w:sz w:val="40"/>
+          <w:szCs w:val="40"/>
+        </w:rPr>
+        <w:lastRenderedPageBreak/>
+        <w:drawing>
+          <wp:inline distT="0" distB="0" distL="0" distR="0" wp14:anchorId="169AE372" wp14:editId="4F144B47">
+            <wp:extent cx="5829805" cy="2644369"/>
+            <wp:effectExtent l="0" t="0" r="0" b="3810"/>
+            <wp:docPr id="2135253655" name="Picture 1"/>
+            <wp:cNvGraphicFramePr>
+              <a:graphicFrameLocks xmlns:a="http://schemas.openxmlformats.org/drawingml/2006/main" noChangeAspect="1"/>
+            </wp:cNvGraphicFramePr>
+            <a:graphic xmlns:a="http://schemas.openxmlformats.org/drawingml/2006/main">
+              <a:graphicData uri="http://schemas.openxmlformats.org/drawingml/2006/picture">
+                <pic:pic xmlns:pic="http://schemas.openxmlformats.org/drawingml/2006/picture">
+                  <pic:nvPicPr>
+                    <pic:cNvPr id="2135253655" name=""/>
+                    <pic:cNvPicPr/>
+                  </pic:nvPicPr>
+                  <pic:blipFill>
+                    <a:blip r:embed="rId13"/>
+                    <a:stretch>
+                      <a:fillRect/>
+                    </a:stretch>
+                  </pic:blipFill>
+                  <pic:spPr>
+                    <a:xfrm>
+                      <a:off x="0" y="0"/>
+                      <a:ext cx="5829805" cy="2644369"/>
+                    </a:xfrm>
+                    <a:prstGeom prst="rect">
+                      <a:avLst/>
+                    </a:prstGeom>
+                  </pic:spPr>
+                </pic:pic>
+              </a:graphicData>
+            </a:graphic>
+          </wp:inline>
+        </w:drawing>
+      </w:r>
+    </w:p>
+    <w:p>
+      <w:pPr>
+        <w:rPr>
+          <w:sz w:val="40"/>
+          <w:szCs w:val="40"/>
+        </w:rPr>
+      </w:pPr>
+      <w:r>
+        <w:rPr>
+          <w:sz w:val="40"/>
+          <w:szCs w:val="40"/>
+        </w:rPr>
+        <w:t xml:space="preserve">Enemies </w:t>
+      </w:r>
+      <w:proofErr w:type="spellStart"/>
+      <w:r>
+        <w:rPr>
+          <w:sz w:val="40"/>
+          <w:szCs w:val="40"/>
+        </w:rPr>
+        <w:t>woooooo</w:t>
+      </w:r>
+      <w:proofErr w:type="spellEnd"/>
     </w:p>
     <w:sectPr>
       <w:pgSz w:w="12240" w:h="15840"/>

</xml_diff>

<commit_message>
Day 2 docu push
</commit_message>
<xml_diff>
--- a/Kevin doc/Kevin Doc Day2.docx
+++ b/Kevin doc/Kevin Doc Day2.docx
@@ -250,27 +250,19 @@
           <w:szCs w:val="40"/>
         </w:rPr>
         <w:lastRenderedPageBreak/>
-        <w:t xml:space="preserve">9:20 – 9:40 Improving Enemy </w:t>
-      </w:r>
-      <w:proofErr w:type="spellStart"/>
-      <w:r>
-        <w:rPr>
-          <w:sz w:val="40"/>
-          <w:szCs w:val="40"/>
-        </w:rPr>
-        <w:t>Behaviour</w:t>
-      </w:r>
-      <w:proofErr w:type="spellEnd"/>
-    </w:p>
-    <w:p>
-      <w:pPr>
-        <w:rPr>
-          <w:sz w:val="40"/>
-          <w:szCs w:val="40"/>
-        </w:rPr>
-      </w:pPr>
-      <w:r>
-        <w:rPr>
+        <w:t>9:20 – 9:40 Improving Enemy Behaviour</w:t>
+      </w:r>
+    </w:p>
+    <w:p>
+      <w:pPr>
+        <w:rPr>
+          <w:sz w:val="40"/>
+          <w:szCs w:val="40"/>
+        </w:rPr>
+      </w:pPr>
+      <w:r>
+        <w:rPr>
+          <w:noProof/>
           <w:sz w:val="40"/>
           <w:szCs w:val="40"/>
         </w:rPr>
@@ -320,6 +312,7 @@
       </w:pPr>
       <w:r>
         <w:rPr>
+          <w:noProof/>
           <w:sz w:val="40"/>
           <w:szCs w:val="40"/>
         </w:rPr>
@@ -376,6 +369,7 @@
       </w:pPr>
       <w:r>
         <w:rPr>
+          <w:noProof/>
           <w:sz w:val="40"/>
           <w:szCs w:val="40"/>
         </w:rPr>
@@ -425,6 +419,7 @@
       </w:pPr>
       <w:r>
         <w:rPr>
+          <w:noProof/>
           <w:sz w:val="40"/>
           <w:szCs w:val="40"/>
         </w:rPr>
@@ -474,6 +469,7 @@
       </w:pPr>
       <w:r>
         <w:rPr>
+          <w:noProof/>
           <w:sz w:val="40"/>
           <w:szCs w:val="40"/>
         </w:rPr>
@@ -523,6 +519,7 @@
       </w:pPr>
       <w:r>
         <w:rPr>
+          <w:noProof/>
           <w:sz w:val="40"/>
           <w:szCs w:val="40"/>
         </w:rPr>
@@ -576,17 +573,823 @@
           <w:sz w:val="40"/>
           <w:szCs w:val="40"/>
         </w:rPr>
-        <w:t xml:space="preserve">Enemies </w:t>
-      </w:r>
-      <w:proofErr w:type="spellStart"/>
-      <w:r>
-        <w:rPr>
-          <w:sz w:val="40"/>
-          <w:szCs w:val="40"/>
-        </w:rPr>
-        <w:t>woooooo</w:t>
-      </w:r>
-      <w:proofErr w:type="spellEnd"/>
+        <w:t>Enemies woooooo</w:t>
+      </w:r>
+    </w:p>
+    <w:p>
+      <w:pPr>
+        <w:rPr>
+          <w:sz w:val="40"/>
+          <w:szCs w:val="40"/>
+        </w:rPr>
+      </w:pPr>
+    </w:p>
+    <w:p>
+      <w:pPr>
+        <w:rPr>
+          <w:sz w:val="40"/>
+          <w:szCs w:val="40"/>
+        </w:rPr>
+      </w:pPr>
+      <w:r>
+        <w:rPr>
+          <w:sz w:val="40"/>
+          <w:szCs w:val="40"/>
+        </w:rPr>
+        <w:t>9:40 – 1</w:t>
+      </w:r>
+      <w:r>
+        <w:rPr>
+          <w:sz w:val="40"/>
+          <w:szCs w:val="40"/>
+        </w:rPr>
+        <w:t>0</w:t>
+      </w:r>
+      <w:r>
+        <w:rPr>
+          <w:sz w:val="40"/>
+          <w:szCs w:val="40"/>
+        </w:rPr>
+        <w:t>:20 -  Adding second enemy</w:t>
+      </w:r>
+    </w:p>
+    <w:p>
+      <w:pPr>
+        <w:rPr>
+          <w:sz w:val="40"/>
+          <w:szCs w:val="40"/>
+        </w:rPr>
+      </w:pPr>
+      <w:r>
+        <w:rPr>
+          <w:sz w:val="40"/>
+          <w:szCs w:val="40"/>
+        </w:rPr>
+        <w:drawing>
+          <wp:inline distT="0" distB="0" distL="0" distR="0" wp14:anchorId="2535210C" wp14:editId="49378BE1">
+            <wp:extent cx="5943600" cy="1324610"/>
+            <wp:effectExtent l="0" t="0" r="0" b="8890"/>
+            <wp:docPr id="1220390493" name="Picture 1"/>
+            <wp:cNvGraphicFramePr>
+              <a:graphicFrameLocks xmlns:a="http://schemas.openxmlformats.org/drawingml/2006/main" noChangeAspect="1"/>
+            </wp:cNvGraphicFramePr>
+            <a:graphic xmlns:a="http://schemas.openxmlformats.org/drawingml/2006/main">
+              <a:graphicData uri="http://schemas.openxmlformats.org/drawingml/2006/picture">
+                <pic:pic xmlns:pic="http://schemas.openxmlformats.org/drawingml/2006/picture">
+                  <pic:nvPicPr>
+                    <pic:cNvPr id="1220390493" name=""/>
+                    <pic:cNvPicPr/>
+                  </pic:nvPicPr>
+                  <pic:blipFill>
+                    <a:blip r:embed="rId14"/>
+                    <a:stretch>
+                      <a:fillRect/>
+                    </a:stretch>
+                  </pic:blipFill>
+                  <pic:spPr>
+                    <a:xfrm>
+                      <a:off x="0" y="0"/>
+                      <a:ext cx="5943600" cy="1324610"/>
+                    </a:xfrm>
+                    <a:prstGeom prst="rect">
+                      <a:avLst/>
+                    </a:prstGeom>
+                  </pic:spPr>
+                </pic:pic>
+              </a:graphicData>
+            </a:graphic>
+          </wp:inline>
+        </w:drawing>
+      </w:r>
+    </w:p>
+    <w:p>
+      <w:pPr>
+        <w:rPr>
+          <w:sz w:val="40"/>
+          <w:szCs w:val="40"/>
+        </w:rPr>
+      </w:pPr>
+      <w:r>
+        <w:rPr>
+          <w:sz w:val="40"/>
+          <w:szCs w:val="40"/>
+        </w:rPr>
+        <w:drawing>
+          <wp:inline distT="0" distB="0" distL="0" distR="0" wp14:anchorId="095E06BC" wp14:editId="7735145D">
+            <wp:extent cx="2834886" cy="548688"/>
+            <wp:effectExtent l="0" t="0" r="3810" b="3810"/>
+            <wp:docPr id="1356668472" name="Picture 1"/>
+            <wp:cNvGraphicFramePr>
+              <a:graphicFrameLocks xmlns:a="http://schemas.openxmlformats.org/drawingml/2006/main" noChangeAspect="1"/>
+            </wp:cNvGraphicFramePr>
+            <a:graphic xmlns:a="http://schemas.openxmlformats.org/drawingml/2006/main">
+              <a:graphicData uri="http://schemas.openxmlformats.org/drawingml/2006/picture">
+                <pic:pic xmlns:pic="http://schemas.openxmlformats.org/drawingml/2006/picture">
+                  <pic:nvPicPr>
+                    <pic:cNvPr id="1356668472" name=""/>
+                    <pic:cNvPicPr/>
+                  </pic:nvPicPr>
+                  <pic:blipFill>
+                    <a:blip r:embed="rId15"/>
+                    <a:stretch>
+                      <a:fillRect/>
+                    </a:stretch>
+                  </pic:blipFill>
+                  <pic:spPr>
+                    <a:xfrm>
+                      <a:off x="0" y="0"/>
+                      <a:ext cx="2834886" cy="548688"/>
+                    </a:xfrm>
+                    <a:prstGeom prst="rect">
+                      <a:avLst/>
+                    </a:prstGeom>
+                  </pic:spPr>
+                </pic:pic>
+              </a:graphicData>
+            </a:graphic>
+          </wp:inline>
+        </w:drawing>
+      </w:r>
+    </w:p>
+    <w:p>
+      <w:pPr>
+        <w:rPr>
+          <w:sz w:val="40"/>
+          <w:szCs w:val="40"/>
+        </w:rPr>
+      </w:pPr>
+      <w:r>
+        <w:rPr>
+          <w:sz w:val="40"/>
+          <w:szCs w:val="40"/>
+        </w:rPr>
+        <w:drawing>
+          <wp:inline distT="0" distB="0" distL="0" distR="0" wp14:anchorId="7EEDBB05" wp14:editId="6DECD0E1">
+            <wp:extent cx="5943600" cy="1209040"/>
+            <wp:effectExtent l="0" t="0" r="0" b="0"/>
+            <wp:docPr id="449418990" name="Picture 1"/>
+            <wp:cNvGraphicFramePr>
+              <a:graphicFrameLocks xmlns:a="http://schemas.openxmlformats.org/drawingml/2006/main" noChangeAspect="1"/>
+            </wp:cNvGraphicFramePr>
+            <a:graphic xmlns:a="http://schemas.openxmlformats.org/drawingml/2006/main">
+              <a:graphicData uri="http://schemas.openxmlformats.org/drawingml/2006/picture">
+                <pic:pic xmlns:pic="http://schemas.openxmlformats.org/drawingml/2006/picture">
+                  <pic:nvPicPr>
+                    <pic:cNvPr id="449418990" name=""/>
+                    <pic:cNvPicPr/>
+                  </pic:nvPicPr>
+                  <pic:blipFill>
+                    <a:blip r:embed="rId16"/>
+                    <a:stretch>
+                      <a:fillRect/>
+                    </a:stretch>
+                  </pic:blipFill>
+                  <pic:spPr>
+                    <a:xfrm>
+                      <a:off x="0" y="0"/>
+                      <a:ext cx="5943600" cy="1209040"/>
+                    </a:xfrm>
+                    <a:prstGeom prst="rect">
+                      <a:avLst/>
+                    </a:prstGeom>
+                  </pic:spPr>
+                </pic:pic>
+              </a:graphicData>
+            </a:graphic>
+          </wp:inline>
+        </w:drawing>
+      </w:r>
+    </w:p>
+    <w:p>
+      <w:pPr>
+        <w:rPr>
+          <w:sz w:val="40"/>
+          <w:szCs w:val="40"/>
+        </w:rPr>
+      </w:pPr>
+    </w:p>
+    <w:p>
+      <w:pPr>
+        <w:rPr>
+          <w:sz w:val="40"/>
+          <w:szCs w:val="40"/>
+        </w:rPr>
+      </w:pPr>
+      <w:r>
+        <w:rPr>
+          <w:sz w:val="40"/>
+          <w:szCs w:val="40"/>
+        </w:rPr>
+        <w:lastRenderedPageBreak/>
+        <w:drawing>
+          <wp:inline distT="0" distB="0" distL="0" distR="0" wp14:anchorId="1EE2172D" wp14:editId="49790FB8">
+            <wp:extent cx="5943600" cy="1068705"/>
+            <wp:effectExtent l="0" t="0" r="0" b="0"/>
+            <wp:docPr id="691470873" name="Picture 1"/>
+            <wp:cNvGraphicFramePr>
+              <a:graphicFrameLocks xmlns:a="http://schemas.openxmlformats.org/drawingml/2006/main" noChangeAspect="1"/>
+            </wp:cNvGraphicFramePr>
+            <a:graphic xmlns:a="http://schemas.openxmlformats.org/drawingml/2006/main">
+              <a:graphicData uri="http://schemas.openxmlformats.org/drawingml/2006/picture">
+                <pic:pic xmlns:pic="http://schemas.openxmlformats.org/drawingml/2006/picture">
+                  <pic:nvPicPr>
+                    <pic:cNvPr id="691470873" name=""/>
+                    <pic:cNvPicPr/>
+                  </pic:nvPicPr>
+                  <pic:blipFill>
+                    <a:blip r:embed="rId17"/>
+                    <a:stretch>
+                      <a:fillRect/>
+                    </a:stretch>
+                  </pic:blipFill>
+                  <pic:spPr>
+                    <a:xfrm>
+                      <a:off x="0" y="0"/>
+                      <a:ext cx="5943600" cy="1068705"/>
+                    </a:xfrm>
+                    <a:prstGeom prst="rect">
+                      <a:avLst/>
+                    </a:prstGeom>
+                  </pic:spPr>
+                </pic:pic>
+              </a:graphicData>
+            </a:graphic>
+          </wp:inline>
+        </w:drawing>
+      </w:r>
+    </w:p>
+    <w:p>
+      <w:pPr>
+        <w:rPr>
+          <w:sz w:val="40"/>
+          <w:szCs w:val="40"/>
+        </w:rPr>
+      </w:pPr>
+      <w:r>
+        <w:rPr>
+          <w:sz w:val="40"/>
+          <w:szCs w:val="40"/>
+        </w:rPr>
+        <w:drawing>
+          <wp:inline distT="0" distB="0" distL="0" distR="0" wp14:anchorId="49315B21" wp14:editId="43FD3E48">
+            <wp:extent cx="5943600" cy="961390"/>
+            <wp:effectExtent l="0" t="0" r="0" b="0"/>
+            <wp:docPr id="485373996" name="Picture 1"/>
+            <wp:cNvGraphicFramePr>
+              <a:graphicFrameLocks xmlns:a="http://schemas.openxmlformats.org/drawingml/2006/main" noChangeAspect="1"/>
+            </wp:cNvGraphicFramePr>
+            <a:graphic xmlns:a="http://schemas.openxmlformats.org/drawingml/2006/main">
+              <a:graphicData uri="http://schemas.openxmlformats.org/drawingml/2006/picture">
+                <pic:pic xmlns:pic="http://schemas.openxmlformats.org/drawingml/2006/picture">
+                  <pic:nvPicPr>
+                    <pic:cNvPr id="485373996" name=""/>
+                    <pic:cNvPicPr/>
+                  </pic:nvPicPr>
+                  <pic:blipFill>
+                    <a:blip r:embed="rId18"/>
+                    <a:stretch>
+                      <a:fillRect/>
+                    </a:stretch>
+                  </pic:blipFill>
+                  <pic:spPr>
+                    <a:xfrm>
+                      <a:off x="0" y="0"/>
+                      <a:ext cx="5943600" cy="961390"/>
+                    </a:xfrm>
+                    <a:prstGeom prst="rect">
+                      <a:avLst/>
+                    </a:prstGeom>
+                  </pic:spPr>
+                </pic:pic>
+              </a:graphicData>
+            </a:graphic>
+          </wp:inline>
+        </w:drawing>
+      </w:r>
+    </w:p>
+    <w:p>
+      <w:pPr>
+        <w:rPr>
+          <w:sz w:val="40"/>
+          <w:szCs w:val="40"/>
+        </w:rPr>
+      </w:pPr>
+    </w:p>
+    <w:p>
+      <w:pPr>
+        <w:rPr>
+          <w:sz w:val="40"/>
+          <w:szCs w:val="40"/>
+        </w:rPr>
+      </w:pPr>
+      <w:r>
+        <w:rPr>
+          <w:sz w:val="40"/>
+          <w:szCs w:val="40"/>
+        </w:rPr>
+        <w:t>1</w:t>
+      </w:r>
+      <w:r>
+        <w:rPr>
+          <w:sz w:val="40"/>
+          <w:szCs w:val="40"/>
+        </w:rPr>
+        <w:t>0</w:t>
+      </w:r>
+      <w:r>
+        <w:rPr>
+          <w:sz w:val="40"/>
+          <w:szCs w:val="40"/>
+        </w:rPr>
+        <w:t>:20 – 1</w:t>
+      </w:r>
+      <w:r>
+        <w:rPr>
+          <w:sz w:val="40"/>
+          <w:szCs w:val="40"/>
+        </w:rPr>
+        <w:t>0</w:t>
+      </w:r>
+      <w:r>
+        <w:rPr>
+          <w:sz w:val="40"/>
+          <w:szCs w:val="40"/>
+        </w:rPr>
+        <w:t xml:space="preserve">:40 – Figuring out the background issue (background not working on </w:t>
+      </w:r>
+      <w:r>
+        <w:rPr>
+          <w:sz w:val="40"/>
+          <w:szCs w:val="40"/>
+        </w:rPr>
+        <w:t>UNI</w:t>
+      </w:r>
+      <w:r>
+        <w:rPr>
+          <w:sz w:val="40"/>
+          <w:szCs w:val="40"/>
+        </w:rPr>
+        <w:t xml:space="preserve"> devices)</w:t>
+      </w:r>
+      <w:r>
+        <w:rPr>
+          <w:sz w:val="40"/>
+          <w:szCs w:val="40"/>
+        </w:rPr>
+        <w:br/>
+      </w:r>
+      <w:r>
+        <w:rPr>
+          <w:sz w:val="40"/>
+          <w:szCs w:val="40"/>
+        </w:rPr>
+        <w:drawing>
+          <wp:inline distT="0" distB="0" distL="0" distR="0" wp14:anchorId="360955F6" wp14:editId="1F338015">
+            <wp:extent cx="5197290" cy="891617"/>
+            <wp:effectExtent l="0" t="0" r="3810" b="3810"/>
+            <wp:docPr id="1021661137" name="Picture 1"/>
+            <wp:cNvGraphicFramePr>
+              <a:graphicFrameLocks xmlns:a="http://schemas.openxmlformats.org/drawingml/2006/main" noChangeAspect="1"/>
+            </wp:cNvGraphicFramePr>
+            <a:graphic xmlns:a="http://schemas.openxmlformats.org/drawingml/2006/main">
+              <a:graphicData uri="http://schemas.openxmlformats.org/drawingml/2006/picture">
+                <pic:pic xmlns:pic="http://schemas.openxmlformats.org/drawingml/2006/picture">
+                  <pic:nvPicPr>
+                    <pic:cNvPr id="1021661137" name=""/>
+                    <pic:cNvPicPr/>
+                  </pic:nvPicPr>
+                  <pic:blipFill>
+                    <a:blip r:embed="rId19"/>
+                    <a:stretch>
+                      <a:fillRect/>
+                    </a:stretch>
+                  </pic:blipFill>
+                  <pic:spPr>
+                    <a:xfrm>
+                      <a:off x="0" y="0"/>
+                      <a:ext cx="5197290" cy="891617"/>
+                    </a:xfrm>
+                    <a:prstGeom prst="rect">
+                      <a:avLst/>
+                    </a:prstGeom>
+                  </pic:spPr>
+                </pic:pic>
+              </a:graphicData>
+            </a:graphic>
+          </wp:inline>
+        </w:drawing>
+      </w:r>
+    </w:p>
+    <w:p>
+      <w:pPr>
+        <w:rPr>
+          <w:sz w:val="40"/>
+          <w:szCs w:val="40"/>
+        </w:rPr>
+      </w:pPr>
+      <w:r>
+        <w:rPr>
+          <w:sz w:val="40"/>
+          <w:szCs w:val="40"/>
+        </w:rPr>
+        <w:drawing>
+          <wp:inline distT="0" distB="0" distL="0" distR="0" wp14:anchorId="19757ACE" wp14:editId="4AF4F984">
+            <wp:extent cx="4861981" cy="838273"/>
+            <wp:effectExtent l="0" t="0" r="0" b="0"/>
+            <wp:docPr id="1588099880" name="Picture 1"/>
+            <wp:cNvGraphicFramePr>
+              <a:graphicFrameLocks xmlns:a="http://schemas.openxmlformats.org/drawingml/2006/main" noChangeAspect="1"/>
+            </wp:cNvGraphicFramePr>
+            <a:graphic xmlns:a="http://schemas.openxmlformats.org/drawingml/2006/main">
+              <a:graphicData uri="http://schemas.openxmlformats.org/drawingml/2006/picture">
+                <pic:pic xmlns:pic="http://schemas.openxmlformats.org/drawingml/2006/picture">
+                  <pic:nvPicPr>
+                    <pic:cNvPr id="1588099880" name=""/>
+                    <pic:cNvPicPr/>
+                  </pic:nvPicPr>
+                  <pic:blipFill>
+                    <a:blip r:embed="rId20"/>
+                    <a:stretch>
+                      <a:fillRect/>
+                    </a:stretch>
+                  </pic:blipFill>
+                  <pic:spPr>
+                    <a:xfrm>
+                      <a:off x="0" y="0"/>
+                      <a:ext cx="4861981" cy="838273"/>
+                    </a:xfrm>
+                    <a:prstGeom prst="rect">
+                      <a:avLst/>
+                    </a:prstGeom>
+                  </pic:spPr>
+                </pic:pic>
+              </a:graphicData>
+            </a:graphic>
+          </wp:inline>
+        </w:drawing>
+      </w:r>
+    </w:p>
+    <w:p>
+      <w:pPr>
+        <w:rPr>
+          <w:sz w:val="40"/>
+          <w:szCs w:val="40"/>
+        </w:rPr>
+      </w:pPr>
+    </w:p>
+    <w:p>
+      <w:pPr>
+        <w:rPr>
+          <w:sz w:val="40"/>
+          <w:szCs w:val="40"/>
+        </w:rPr>
+      </w:pPr>
+    </w:p>
+    <w:p>
+      <w:pPr>
+        <w:rPr>
+          <w:sz w:val="40"/>
+          <w:szCs w:val="40"/>
+        </w:rPr>
+      </w:pPr>
+    </w:p>
+    <w:p>
+      <w:pPr>
+        <w:rPr>
+          <w:sz w:val="40"/>
+          <w:szCs w:val="40"/>
+        </w:rPr>
+      </w:pPr>
+    </w:p>
+    <w:p>
+      <w:pPr>
+        <w:rPr>
+          <w:sz w:val="40"/>
+          <w:szCs w:val="40"/>
+        </w:rPr>
+      </w:pPr>
+    </w:p>
+    <w:p>
+      <w:pPr>
+        <w:rPr>
+          <w:sz w:val="40"/>
+          <w:szCs w:val="40"/>
+        </w:rPr>
+      </w:pPr>
+    </w:p>
+    <w:p>
+      <w:pPr>
+        <w:rPr>
+          <w:sz w:val="40"/>
+          <w:szCs w:val="40"/>
+        </w:rPr>
+      </w:pPr>
+      <w:r>
+        <w:rPr>
+          <w:sz w:val="40"/>
+          <w:szCs w:val="40"/>
+        </w:rPr>
+        <w:lastRenderedPageBreak/>
+        <w:t>1</w:t>
+      </w:r>
+      <w:r>
+        <w:rPr>
+          <w:sz w:val="40"/>
+          <w:szCs w:val="40"/>
+        </w:rPr>
+        <w:t>0</w:t>
+      </w:r>
+      <w:r>
+        <w:rPr>
+          <w:sz w:val="40"/>
+          <w:szCs w:val="40"/>
+        </w:rPr>
+        <w:t>:40  - 1</w:t>
+      </w:r>
+      <w:r>
+        <w:rPr>
+          <w:sz w:val="40"/>
+          <w:szCs w:val="40"/>
+        </w:rPr>
+        <w:t>0</w:t>
+      </w:r>
+      <w:r>
+        <w:rPr>
+          <w:sz w:val="40"/>
+          <w:szCs w:val="40"/>
+        </w:rPr>
+        <w:t>:50 Catching up with the AI</w:t>
+      </w:r>
+    </w:p>
+    <w:p>
+      <w:pPr>
+        <w:rPr>
+          <w:sz w:val="40"/>
+          <w:szCs w:val="40"/>
+        </w:rPr>
+      </w:pPr>
+      <w:r>
+        <w:rPr>
+          <w:sz w:val="40"/>
+          <w:szCs w:val="40"/>
+        </w:rPr>
+        <w:drawing>
+          <wp:inline distT="0" distB="0" distL="0" distR="0" wp14:anchorId="7C1C67B2" wp14:editId="7C51DA41">
+            <wp:extent cx="5943600" cy="3009900"/>
+            <wp:effectExtent l="0" t="0" r="0" b="0"/>
+            <wp:docPr id="6409132" name="Picture 1"/>
+            <wp:cNvGraphicFramePr>
+              <a:graphicFrameLocks xmlns:a="http://schemas.openxmlformats.org/drawingml/2006/main" noChangeAspect="1"/>
+            </wp:cNvGraphicFramePr>
+            <a:graphic xmlns:a="http://schemas.openxmlformats.org/drawingml/2006/main">
+              <a:graphicData uri="http://schemas.openxmlformats.org/drawingml/2006/picture">
+                <pic:pic xmlns:pic="http://schemas.openxmlformats.org/drawingml/2006/picture">
+                  <pic:nvPicPr>
+                    <pic:cNvPr id="6409132" name=""/>
+                    <pic:cNvPicPr/>
+                  </pic:nvPicPr>
+                  <pic:blipFill>
+                    <a:blip r:embed="rId21"/>
+                    <a:stretch>
+                      <a:fillRect/>
+                    </a:stretch>
+                  </pic:blipFill>
+                  <pic:spPr>
+                    <a:xfrm>
+                      <a:off x="0" y="0"/>
+                      <a:ext cx="5943600" cy="3009900"/>
+                    </a:xfrm>
+                    <a:prstGeom prst="rect">
+                      <a:avLst/>
+                    </a:prstGeom>
+                  </pic:spPr>
+                </pic:pic>
+              </a:graphicData>
+            </a:graphic>
+          </wp:inline>
+        </w:drawing>
+      </w:r>
+    </w:p>
+    <w:p>
+      <w:pPr>
+        <w:rPr>
+          <w:sz w:val="40"/>
+          <w:szCs w:val="40"/>
+        </w:rPr>
+      </w:pPr>
+      <w:r>
+        <w:rPr>
+          <w:sz w:val="40"/>
+          <w:szCs w:val="40"/>
+        </w:rPr>
+        <w:drawing>
+          <wp:inline distT="0" distB="0" distL="0" distR="0" wp14:anchorId="03D20EB7" wp14:editId="6E3902B1">
+            <wp:extent cx="5943600" cy="2713990"/>
+            <wp:effectExtent l="0" t="0" r="0" b="0"/>
+            <wp:docPr id="1782520210" name="Picture 1"/>
+            <wp:cNvGraphicFramePr>
+              <a:graphicFrameLocks xmlns:a="http://schemas.openxmlformats.org/drawingml/2006/main" noChangeAspect="1"/>
+            </wp:cNvGraphicFramePr>
+            <a:graphic xmlns:a="http://schemas.openxmlformats.org/drawingml/2006/main">
+              <a:graphicData uri="http://schemas.openxmlformats.org/drawingml/2006/picture">
+                <pic:pic xmlns:pic="http://schemas.openxmlformats.org/drawingml/2006/picture">
+                  <pic:nvPicPr>
+                    <pic:cNvPr id="1782520210" name=""/>
+                    <pic:cNvPicPr/>
+                  </pic:nvPicPr>
+                  <pic:blipFill>
+                    <a:blip r:embed="rId22"/>
+                    <a:stretch>
+                      <a:fillRect/>
+                    </a:stretch>
+                  </pic:blipFill>
+                  <pic:spPr>
+                    <a:xfrm>
+                      <a:off x="0" y="0"/>
+                      <a:ext cx="5943600" cy="2713990"/>
+                    </a:xfrm>
+                    <a:prstGeom prst="rect">
+                      <a:avLst/>
+                    </a:prstGeom>
+                  </pic:spPr>
+                </pic:pic>
+              </a:graphicData>
+            </a:graphic>
+          </wp:inline>
+        </w:drawing>
+      </w:r>
+      <w:r>
+        <w:rPr>
+          <w:sz w:val="40"/>
+          <w:szCs w:val="40"/>
+        </w:rPr>
+        <w:drawing>
+          <wp:inline distT="0" distB="0" distL="0" distR="0" wp14:anchorId="2317F29A" wp14:editId="68C2D5D6">
+            <wp:extent cx="3162574" cy="876376"/>
+            <wp:effectExtent l="0" t="0" r="0" b="0"/>
+            <wp:docPr id="1930702771" name="Picture 1"/>
+            <wp:cNvGraphicFramePr>
+              <a:graphicFrameLocks xmlns:a="http://schemas.openxmlformats.org/drawingml/2006/main" noChangeAspect="1"/>
+            </wp:cNvGraphicFramePr>
+            <a:graphic xmlns:a="http://schemas.openxmlformats.org/drawingml/2006/main">
+              <a:graphicData uri="http://schemas.openxmlformats.org/drawingml/2006/picture">
+                <pic:pic xmlns:pic="http://schemas.openxmlformats.org/drawingml/2006/picture">
+                  <pic:nvPicPr>
+                    <pic:cNvPr id="1930702771" name=""/>
+                    <pic:cNvPicPr/>
+                  </pic:nvPicPr>
+                  <pic:blipFill>
+                    <a:blip r:embed="rId23"/>
+                    <a:stretch>
+                      <a:fillRect/>
+                    </a:stretch>
+                  </pic:blipFill>
+                  <pic:spPr>
+                    <a:xfrm>
+                      <a:off x="0" y="0"/>
+                      <a:ext cx="3162574" cy="876376"/>
+                    </a:xfrm>
+                    <a:prstGeom prst="rect">
+                      <a:avLst/>
+                    </a:prstGeom>
+                  </pic:spPr>
+                </pic:pic>
+              </a:graphicData>
+            </a:graphic>
+          </wp:inline>
+        </w:drawing>
+      </w:r>
+    </w:p>
+    <w:p>
+      <w:pPr>
+        <w:rPr>
+          <w:sz w:val="40"/>
+          <w:szCs w:val="40"/>
+        </w:rPr>
+      </w:pPr>
+    </w:p>
+    <w:p>
+      <w:pPr>
+        <w:rPr>
+          <w:sz w:val="40"/>
+          <w:szCs w:val="40"/>
+        </w:rPr>
+      </w:pPr>
+    </w:p>
+    <w:p>
+      <w:pPr>
+        <w:rPr>
+          <w:sz w:val="40"/>
+          <w:szCs w:val="40"/>
+        </w:rPr>
+      </w:pPr>
+      <w:r>
+        <w:rPr>
+          <w:sz w:val="40"/>
+          <w:szCs w:val="40"/>
+        </w:rPr>
+        <w:lastRenderedPageBreak/>
+        <w:t>1</w:t>
+      </w:r>
+      <w:r>
+        <w:rPr>
+          <w:sz w:val="40"/>
+          <w:szCs w:val="40"/>
+        </w:rPr>
+        <w:t>0</w:t>
+      </w:r>
+      <w:r>
+        <w:rPr>
+          <w:sz w:val="40"/>
+          <w:szCs w:val="40"/>
+        </w:rPr>
+        <w:t>:50 – 1</w:t>
+      </w:r>
+      <w:r>
+        <w:rPr>
+          <w:sz w:val="40"/>
+          <w:szCs w:val="40"/>
+        </w:rPr>
+        <w:t>1</w:t>
+      </w:r>
+      <w:r>
+        <w:rPr>
+          <w:sz w:val="40"/>
+          <w:szCs w:val="40"/>
+        </w:rPr>
+        <w:t>:00</w:t>
+      </w:r>
+      <w:r>
+        <w:rPr>
+          <w:sz w:val="40"/>
+          <w:szCs w:val="40"/>
+        </w:rPr>
+        <w:t xml:space="preserve"> – Adding a second player</w:t>
+      </w:r>
+    </w:p>
+    <w:p>
+      <w:pPr>
+        <w:rPr>
+          <w:sz w:val="40"/>
+          <w:szCs w:val="40"/>
+        </w:rPr>
+      </w:pPr>
+      <w:r>
+        <w:rPr>
+          <w:sz w:val="40"/>
+          <w:szCs w:val="40"/>
+        </w:rPr>
+        <w:drawing>
+          <wp:inline distT="0" distB="0" distL="0" distR="0" wp14:anchorId="4A05792F" wp14:editId="51C29DCC">
+            <wp:extent cx="5943600" cy="1034415"/>
+            <wp:effectExtent l="0" t="0" r="0" b="0"/>
+            <wp:docPr id="1600185849" name="Picture 1"/>
+            <wp:cNvGraphicFramePr>
+              <a:graphicFrameLocks xmlns:a="http://schemas.openxmlformats.org/drawingml/2006/main" noChangeAspect="1"/>
+            </wp:cNvGraphicFramePr>
+            <a:graphic xmlns:a="http://schemas.openxmlformats.org/drawingml/2006/main">
+              <a:graphicData uri="http://schemas.openxmlformats.org/drawingml/2006/picture">
+                <pic:pic xmlns:pic="http://schemas.openxmlformats.org/drawingml/2006/picture">
+                  <pic:nvPicPr>
+                    <pic:cNvPr id="1600185849" name=""/>
+                    <pic:cNvPicPr/>
+                  </pic:nvPicPr>
+                  <pic:blipFill>
+                    <a:blip r:embed="rId24"/>
+                    <a:stretch>
+                      <a:fillRect/>
+                    </a:stretch>
+                  </pic:blipFill>
+                  <pic:spPr>
+                    <a:xfrm>
+                      <a:off x="0" y="0"/>
+                      <a:ext cx="5943600" cy="1034415"/>
+                    </a:xfrm>
+                    <a:prstGeom prst="rect">
+                      <a:avLst/>
+                    </a:prstGeom>
+                  </pic:spPr>
+                </pic:pic>
+              </a:graphicData>
+            </a:graphic>
+          </wp:inline>
+        </w:drawing>
+      </w:r>
+    </w:p>
+    <w:p>
+      <w:pPr>
+        <w:rPr>
+          <w:sz w:val="40"/>
+          <w:szCs w:val="40"/>
+        </w:rPr>
+      </w:pPr>
+      <w:r>
+        <w:rPr>
+          <w:sz w:val="40"/>
+          <w:szCs w:val="40"/>
+        </w:rPr>
+        <w:t>Worked immediately!!</w:t>
+      </w:r>
     </w:p>
     <w:sectPr>
       <w:pgSz w:w="12240" w:h="15840"/>

</xml_diff>